<commit_message>
Updated intake air recommendation
</commit_message>
<xml_diff>
--- a/Compressor/Intake Air/template.docx
+++ b/Compressor/Intake Air/template.docx
@@ -589,7 +589,19 @@
         <w:rPr>
           <w:color w:val="000000"/>
         </w:rPr>
-        <w:t>A compressor does less work to compress colder air.</w:t>
+        <w:t xml:space="preserve">A compressor does less work </w:t>
+      </w:r>
+      <w:r>
+        <w:rPr>
+          <w:color w:val="000000"/>
+        </w:rPr>
+        <w:t>compressing</w:t>
+      </w:r>
+      <w:r>
+        <w:rPr>
+          <w:color w:val="000000"/>
+        </w:rPr>
+        <w:t xml:space="preserve"> colder air.</w:t>
       </w:r>
       <w:r>
         <w:rPr>
@@ -636,7 +648,26 @@
           <w:color w:val="000000"/>
         </w:rPr>
         <w:tab/>
-        <w:t>= (T</w:t>
+        <w:t xml:space="preserve">= </w:t>
+      </w:r>
+      <w:r>
+        <w:rPr>
+          <w:rFonts w:ascii="Cambria Math" w:hAnsi="Cambria Math"/>
+          <w:color w:val="000000"/>
+        </w:rPr>
+        <w:t>𝞓</w:t>
+      </w:r>
+      <w:r>
+        <w:rPr>
+          <w:color w:val="000000"/>
+        </w:rPr>
+        <w:t>T</w:t>
+      </w:r>
+      <w:r>
+        <w:rPr>
+          <w:color w:val="000000"/>
+        </w:rPr>
+        <w:t xml:space="preserve"> / (T</w:t>
       </w:r>
       <w:r>
         <w:rPr>
@@ -649,45 +680,6 @@
         <w:rPr>
           <w:color w:val="000000"/>
         </w:rPr>
-        <w:t xml:space="preserve"> </w:t>
-      </w:r>
-      <w:r>
-        <w:rPr>
-          <w:rFonts w:eastAsia="Symbol"/>
-          <w:color w:val="000000"/>
-        </w:rPr>
-        <w:t>-</w:t>
-      </w:r>
-      <w:r>
-        <w:rPr>
-          <w:color w:val="000000"/>
-        </w:rPr>
-        <w:t xml:space="preserve"> T</w:t>
-      </w:r>
-      <w:r>
-        <w:rPr>
-          <w:color w:val="000000"/>
-          <w:vertAlign w:val="subscript"/>
-        </w:rPr>
-        <w:t>O</w:t>
-      </w:r>
-      <w:r>
-        <w:rPr>
-          <w:color w:val="000000"/>
-        </w:rPr>
-        <w:t>) / (T</w:t>
-      </w:r>
-      <w:r>
-        <w:rPr>
-          <w:color w:val="000000"/>
-          <w:vertAlign w:val="subscript"/>
-        </w:rPr>
-        <w:t>I</w:t>
-      </w:r>
-      <w:r>
-        <w:rPr>
-          <w:color w:val="000000"/>
-        </w:rPr>
         <w:t xml:space="preserve"> + 460</w:t>
       </w:r>
       <w:r>
@@ -697,6 +689,7 @@
         </w:rPr>
         <w:t xml:space="preserve"> </w:t>
       </w:r>
+      <w:proofErr w:type="spellStart"/>
       <w:r>
         <w:rPr>
           <w:color w:val="000000"/>
@@ -710,6 +703,7 @@
         </w:rPr>
         <w:t>F</w:t>
       </w:r>
+      <w:proofErr w:type="spellEnd"/>
       <w:r>
         <w:rPr>
           <w:color w:val="000000"/>
@@ -732,11 +726,25 @@
           <w:color w:val="000000"/>
         </w:rPr>
       </w:pPr>
-      <w:r>
-        <w:rPr>
-          <w:color w:val="000000"/>
-        </w:rPr>
-        <w:t>where</w:t>
+      <w:proofErr w:type="gramStart"/>
+      <w:r>
+        <w:rPr>
+          <w:color w:val="000000"/>
+        </w:rPr>
+        <w:t>w</w:t>
+      </w:r>
+      <w:r>
+        <w:rPr>
+          <w:color w:val="000000"/>
+        </w:rPr>
+        <w:t>here</w:t>
+      </w:r>
+      <w:proofErr w:type="gramEnd"/>
+      <w:r>
+        <w:rPr>
+          <w:color w:val="000000"/>
+        </w:rPr>
+        <w:t>,</w:t>
       </w:r>
     </w:p>
     <w:p>
@@ -762,6 +770,13 @@
       </w:r>
       <w:r>
         <w:rPr>
+          <w:rFonts w:ascii="Cambria Math" w:hAnsi="Cambria Math"/>
+          <w:color w:val="000000"/>
+        </w:rPr>
+        <w:t>𝞓</w:t>
+      </w:r>
+      <w:r>
+        <w:rPr>
           <w:color w:val="000000"/>
         </w:rPr>
         <w:t>T</w:t>
@@ -769,16 +784,27 @@
       <w:r>
         <w:rPr>
           <w:color w:val="000000"/>
-          <w:vertAlign w:val="subscript"/>
-        </w:rPr>
-        <w:t>I</w:t>
-      </w:r>
-      <w:r>
-        <w:rPr>
-          <w:color w:val="000000"/>
-        </w:rPr>
-        <w:tab/>
-        <w:t>= Average indoor temperature</w:t>
+        </w:rPr>
+        <w:tab/>
+        <w:t xml:space="preserve">= Average </w:t>
+      </w:r>
+      <w:r>
+        <w:rPr>
+          <w:color w:val="000000"/>
+        </w:rPr>
+        <w:t xml:space="preserve">difference in </w:t>
+      </w:r>
+      <w:r>
+        <w:rPr>
+          <w:color w:val="000000"/>
+        </w:rPr>
+        <w:t>indoor temperature</w:t>
+      </w:r>
+      <w:r>
+        <w:rPr>
+          <w:color w:val="000000"/>
+        </w:rPr>
+        <w:t xml:space="preserve"> vs. outdoor temperature</w:t>
       </w:r>
       <w:r>
         <w:rPr>
@@ -796,11 +822,12 @@
         <w:t>${</w:t>
       </w:r>
       <w:r>
-        <w:t>TI</w:t>
+        <w:t>DT</w:t>
       </w:r>
       <w:r>
         <w:t>}</w:t>
       </w:r>
+      <w:proofErr w:type="spellStart"/>
       <w:r>
         <w:rPr>
           <w:color w:val="000000"/>
@@ -814,6 +841,7 @@
         </w:rPr>
         <w:t>F</w:t>
       </w:r>
+      <w:proofErr w:type="spellEnd"/>
     </w:p>
     <w:p>
       <w:pPr>
@@ -842,7 +870,7 @@
           <w:color w:val="000000"/>
           <w:vertAlign w:val="subscript"/>
         </w:rPr>
-        <w:t>O</w:t>
+        <w:t>I</w:t>
       </w:r>
       <w:r>
         <w:rPr>
@@ -867,7 +895,13 @@
         <w:rPr>
           <w:color w:val="000000"/>
         </w:rPr>
-        <w:t xml:space="preserve">outdoor </w:t>
+        <w:t>indoor</w:t>
+      </w:r>
+      <w:r>
+        <w:rPr>
+          <w:color w:val="000000"/>
+        </w:rPr>
+        <w:t xml:space="preserve"> </w:t>
       </w:r>
       <w:r>
         <w:rPr>
@@ -879,36 +913,6 @@
         <w:rPr>
           <w:color w:val="000000"/>
         </w:rPr>
-        <w:t xml:space="preserve"> </w:t>
-      </w:r>
-      <w:r>
-        <w:rPr>
-          <w:color w:val="000000"/>
-        </w:rPr>
-        <w:t xml:space="preserve">during </w:t>
-      </w:r>
-      <w:r>
-        <w:rPr>
-          <w:color w:val="000000"/>
-        </w:rPr>
-        <w:t>heating</w:t>
-      </w:r>
-      <w:r>
-        <w:rPr>
-          <w:color w:val="000000"/>
-        </w:rPr>
-        <w:t xml:space="preserve"> season</w:t>
-      </w:r>
-      <w:r>
-        <w:rPr>
-          <w:color w:val="000000"/>
-        </w:rPr>
-        <w:t xml:space="preserve"> (Oct - May)</w:t>
-      </w:r>
-      <w:r>
-        <w:rPr>
-          <w:color w:val="000000"/>
-        </w:rPr>
         <w:t>:</w:t>
       </w:r>
       <w:r>
@@ -918,8 +922,15 @@
         <w:t xml:space="preserve"> </w:t>
       </w:r>
       <w:r>
-        <w:t>${TO}</w:t>
-      </w:r>
+        <w:t>${T</w:t>
+      </w:r>
+      <w:r>
+        <w:t>I</w:t>
+      </w:r>
+      <w:r>
+        <w:t>}</w:t>
+      </w:r>
+      <w:proofErr w:type="spellStart"/>
       <w:r>
         <w:rPr>
           <w:color w:val="000000"/>
@@ -933,13 +944,7 @@
         </w:rPr>
         <w:t>F</w:t>
       </w:r>
-      <w:r>
-        <w:rPr>
-          <w:rStyle w:val="FootnoteReference"/>
-          <w:color w:val="000000"/>
-        </w:rPr>
-        <w:footnoteReference w:id="1"/>
-      </w:r>
+      <w:proofErr w:type="spellEnd"/>
     </w:p>
     <w:p>
       <w:pPr>
@@ -974,17 +979,45 @@
           <w:color w:val="000000"/>
         </w:rPr>
         <w:tab/>
-        <w:t>= (</w:t>
+        <w:t xml:space="preserve">= </w:t>
       </w:r>
       <w:r>
         <w:t>${</w:t>
       </w:r>
       <w:r>
+        <w:t>DT}</w:t>
+      </w:r>
+      <w:proofErr w:type="spellStart"/>
+      <w:r>
+        <w:rPr>
+          <w:color w:val="000000"/>
+          <w:vertAlign w:val="superscript"/>
+        </w:rPr>
+        <w:t>o</w:t>
+      </w:r>
+      <w:r>
+        <w:rPr>
+          <w:color w:val="000000"/>
+        </w:rPr>
+        <w:t>F</w:t>
+      </w:r>
+      <w:proofErr w:type="spellEnd"/>
+      <w:r>
+        <w:rPr>
+          <w:color w:val="000000"/>
+        </w:rPr>
+        <w:t xml:space="preserve"> / (</w:t>
+      </w:r>
+      <w:r>
+        <w:t>${</w:t>
+      </w:r>
+      <w:r>
         <w:t>TI</w:t>
       </w:r>
       <w:r>
         <w:t>}</w:t>
       </w:r>
+      <w:proofErr w:type="spellStart"/>
       <w:r>
         <w:rPr>
           <w:color w:val="000000"/>
@@ -996,51 +1029,14 @@
         <w:rPr>
           <w:color w:val="000000"/>
         </w:rPr>
-        <w:t xml:space="preserve">F - </w:t>
-      </w:r>
-      <w:r>
-        <w:t>${</w:t>
-      </w:r>
-      <w:r>
-        <w:t>TO</w:t>
-      </w:r>
-      <w:r>
-        <w:t>}</w:t>
-      </w:r>
-      <w:r>
-        <w:rPr>
-          <w:color w:val="000000"/>
-          <w:vertAlign w:val="superscript"/>
-        </w:rPr>
-        <w:t>o</w:t>
-      </w:r>
-      <w:r>
-        <w:rPr>
-          <w:color w:val="000000"/>
-        </w:rPr>
-        <w:t>F) / (</w:t>
-      </w:r>
-      <w:r>
-        <w:t>${</w:t>
-      </w:r>
-      <w:r>
-        <w:t>TI</w:t>
-      </w:r>
-      <w:r>
-        <w:t>}</w:t>
-      </w:r>
-      <w:r>
-        <w:rPr>
-          <w:color w:val="000000"/>
-          <w:vertAlign w:val="superscript"/>
-        </w:rPr>
-        <w:t>o</w:t>
-      </w:r>
-      <w:r>
-        <w:rPr>
-          <w:color w:val="000000"/>
-        </w:rPr>
-        <w:t>F + 460</w:t>
+        <w:t>F</w:t>
+      </w:r>
+      <w:proofErr w:type="spellEnd"/>
+      <w:r>
+        <w:rPr>
+          <w:color w:val="000000"/>
+        </w:rPr>
+        <w:t xml:space="preserve"> + 460</w:t>
       </w:r>
       <w:r>
         <w:rPr>
@@ -1116,7 +1112,6 @@
         <w:rPr>
           <w:color w:val="000000"/>
         </w:rPr>
-        <w:lastRenderedPageBreak/>
         <w:tab/>
       </w:r>
       <w:r>
@@ -1223,7 +1218,13 @@
         <w:rPr>
           <w:color w:val="000000"/>
         </w:rPr>
-        <w:t>FR</w:t>
+        <w:t>F</w:t>
+      </w:r>
+      <w:r>
+        <w:rPr>
+          <w:color w:val="000000"/>
+        </w:rPr>
+        <w:t>P</w:t>
       </w:r>
       <w:r>
         <w:rPr>
@@ -1265,10 +1266,12 @@
           <w:color w:val="000000"/>
         </w:rPr>
       </w:pPr>
-      <w:r>
-        <w:rPr>
-          <w:color w:val="000000"/>
-        </w:rPr>
+      <w:proofErr w:type="gramStart"/>
+      <w:r>
+        <w:rPr>
+          <w:color w:val="000000"/>
+        </w:rPr>
+        <w:lastRenderedPageBreak/>
         <w:t>w</w:t>
       </w:r>
       <w:r>
@@ -1277,6 +1280,7 @@
         </w:rPr>
         <w:t>here</w:t>
       </w:r>
+      <w:proofErr w:type="gramEnd"/>
       <w:r>
         <w:rPr>
           <w:color w:val="000000"/>
@@ -1437,7 +1441,13 @@
         <w:rPr>
           <w:color w:val="000000"/>
         </w:rPr>
-        <w:t>FR</w:t>
+        <w:t>F</w:t>
+      </w:r>
+      <w:r>
+        <w:rPr>
+          <w:color w:val="000000"/>
+        </w:rPr>
+        <w:t>P</w:t>
       </w:r>
       <w:r>
         <w:rPr>
@@ -1474,7 +1484,10 @@
         <w:t>${</w:t>
       </w:r>
       <w:r>
-        <w:t>FR</w:t>
+        <w:t>F</w:t>
+      </w:r>
+      <w:r>
+        <w:t>PC</w:t>
       </w:r>
       <w:r>
         <w:t>}</w:t>
@@ -1623,7 +1636,10 @@
         <w:t>${</w:t>
       </w:r>
       <w:r>
-        <w:t>FR</w:t>
+        <w:t>F</w:t>
+      </w:r>
+      <w:r>
+        <w:t>PC</w:t>
       </w:r>
       <w:r>
         <w:t>}</w:t>
@@ -1767,7 +1783,25 @@
         <w:rPr>
           <w:color w:val="000000"/>
         </w:rPr>
-        <w:t>The annual energy savings ES</w:t>
+        <w:t>The annual energy savings</w:t>
+      </w:r>
+      <w:r>
+        <w:rPr>
+          <w:color w:val="000000"/>
+        </w:rPr>
+        <w:t>,</w:t>
+      </w:r>
+      <w:r>
+        <w:rPr>
+          <w:color w:val="000000"/>
+        </w:rPr>
+        <w:t xml:space="preserve"> ES</w:t>
+      </w:r>
+      <w:r>
+        <w:rPr>
+          <w:color w:val="000000"/>
+        </w:rPr>
+        <w:t>,</w:t>
       </w:r>
       <w:r>
         <w:rPr>
@@ -1856,6 +1890,7 @@
           <w:color w:val="000000"/>
         </w:rPr>
       </w:pPr>
+      <w:proofErr w:type="gramStart"/>
       <w:r>
         <w:rPr>
           <w:color w:val="000000"/>
@@ -1868,6 +1903,7 @@
         </w:rPr>
         <w:t>here</w:t>
       </w:r>
+      <w:proofErr w:type="gramEnd"/>
       <w:r>
         <w:rPr>
           <w:color w:val="000000"/>
@@ -1960,7 +1996,14 @@
         <w:rPr>
           <w:color w:val="000000"/>
         </w:rPr>
-        <w:t xml:space="preserve"> hr</w:t>
+        <w:t xml:space="preserve"> </w:t>
+      </w:r>
+      <w:proofErr w:type="spellStart"/>
+      <w:r>
+        <w:rPr>
+          <w:color w:val="000000"/>
+        </w:rPr>
+        <w:t>hr</w:t>
       </w:r>
       <w:r>
         <w:rPr>
@@ -1968,6 +2011,7 @@
         </w:rPr>
         <w:t>s</w:t>
       </w:r>
+      <w:proofErr w:type="spellEnd"/>
       <w:r>
         <w:rPr>
           <w:color w:val="000000"/>
@@ -1990,8 +2034,16 @@
         <w:rPr>
           <w:color w:val="000000"/>
         </w:rPr>
-        <w:t xml:space="preserve"> hrs</w:t>
-      </w:r>
+        <w:t xml:space="preserve"> </w:t>
+      </w:r>
+      <w:proofErr w:type="spellStart"/>
+      <w:r>
+        <w:rPr>
+          <w:color w:val="000000"/>
+        </w:rPr>
+        <w:t>hrs</w:t>
+      </w:r>
+      <w:proofErr w:type="spellEnd"/>
       <w:r>
         <w:rPr>
           <w:color w:val="000000"/>
@@ -2028,11 +2080,19 @@
         </w:rPr>
         <w:t>/</w:t>
       </w:r>
-      <w:r>
-        <w:rPr>
-          <w:color w:val="000000"/>
-        </w:rPr>
-        <w:t xml:space="preserve">wk, </w:t>
+      <w:proofErr w:type="spellStart"/>
+      <w:r>
+        <w:rPr>
+          <w:color w:val="000000"/>
+        </w:rPr>
+        <w:t>wk</w:t>
+      </w:r>
+      <w:proofErr w:type="spellEnd"/>
+      <w:r>
+        <w:rPr>
+          <w:color w:val="000000"/>
+        </w:rPr>
+        <w:t xml:space="preserve">, </w:t>
       </w:r>
       <w:r>
         <w:rPr>
@@ -2044,8 +2104,16 @@
         <w:rPr>
           <w:color w:val="000000"/>
         </w:rPr>
-        <w:t xml:space="preserve"> wks</w:t>
-      </w:r>
+        <w:t xml:space="preserve"> </w:t>
+      </w:r>
+      <w:proofErr w:type="spellStart"/>
+      <w:r>
+        <w:rPr>
+          <w:color w:val="000000"/>
+        </w:rPr>
+        <w:t>wks</w:t>
+      </w:r>
+      <w:proofErr w:type="spellEnd"/>
       <w:r>
         <w:rPr>
           <w:color w:val="000000"/>
@@ -2125,7 +2193,14 @@
         <w:rPr>
           <w:color w:val="000000"/>
         </w:rPr>
-        <w:t xml:space="preserve"> hr</w:t>
+        <w:t xml:space="preserve"> </w:t>
+      </w:r>
+      <w:proofErr w:type="spellStart"/>
+      <w:r>
+        <w:rPr>
+          <w:color w:val="000000"/>
+        </w:rPr>
+        <w:t>hr</w:t>
       </w:r>
       <w:r>
         <w:rPr>
@@ -2133,6 +2208,7 @@
         </w:rPr>
         <w:t>s</w:t>
       </w:r>
+      <w:proofErr w:type="spellEnd"/>
       <w:r>
         <w:rPr>
           <w:color w:val="000000"/>
@@ -2260,7 +2336,19 @@
         <w:rPr>
           <w:color w:val="000000"/>
         </w:rPr>
-        <w:t>, is as follows:</w:t>
+        <w:t xml:space="preserve">, </w:t>
+      </w:r>
+      <w:r>
+        <w:rPr>
+          <w:color w:val="000000"/>
+        </w:rPr>
+        <w:t>are</w:t>
+      </w:r>
+      <w:r>
+        <w:rPr>
+          <w:color w:val="000000"/>
+        </w:rPr>
+        <w:t xml:space="preserve"> as follows:</w:t>
       </w:r>
     </w:p>
     <w:p>
@@ -2325,26 +2413,7 @@
         <w:rPr>
           <w:color w:val="000000"/>
         </w:rPr>
-        <w:t xml:space="preserve"> CF </w:t>
-      </w:r>
-      <w:r>
-        <w:rPr>
-          <w:color w:val="000000"/>
-        </w:rPr>
-        <w:t>×</w:t>
-      </w:r>
-      <w:r>
-        <w:rPr>
-          <w:color w:val="000000"/>
-        </w:rPr>
-        <w:t xml:space="preserve"> C</w:t>
-      </w:r>
-      <w:r>
-        <w:rPr>
-          <w:color w:val="000000"/>
-          <w:vertAlign w:val="subscript"/>
-        </w:rPr>
-        <w:t>2</w:t>
+        <w:t xml:space="preserve"> CF</w:t>
       </w:r>
     </w:p>
     <w:p>
@@ -2362,6 +2431,7 @@
           <w:color w:val="000000"/>
         </w:rPr>
       </w:pPr>
+      <w:proofErr w:type="gramStart"/>
       <w:r>
         <w:rPr>
           <w:color w:val="000000"/>
@@ -2374,6 +2444,7 @@
         </w:rPr>
         <w:t>here</w:t>
       </w:r>
+      <w:proofErr w:type="gramEnd"/>
     </w:p>
     <w:p>
       <w:pPr>
@@ -2420,106 +2491,76 @@
           <w:color w:val="000000"/>
         </w:rPr>
         <w:tab/>
-        <w:t>C</w:t>
-      </w:r>
-      <w:r>
-        <w:rPr>
-          <w:color w:val="000000"/>
-          <w:vertAlign w:val="subscript"/>
-        </w:rPr>
-        <w:t>2</w:t>
-      </w:r>
-      <w:r>
-        <w:rPr>
-          <w:color w:val="000000"/>
-        </w:rPr>
-        <w:tab/>
-        <w:t>= Conversion constant</w:t>
-      </w:r>
-      <w:r>
-        <w:rPr>
-          <w:color w:val="000000"/>
-        </w:rPr>
-        <w:t>:</w:t>
-      </w:r>
-      <w:r>
-        <w:rPr>
-          <w:color w:val="000000"/>
-        </w:rPr>
-        <w:t xml:space="preserve"> </w:t>
-      </w:r>
-      <w:r>
-        <w:rPr>
-          <w:color w:val="000000"/>
-        </w:rPr>
-        <w:t>${C</w:t>
-      </w:r>
-      <w:r>
-        <w:rPr>
-          <w:color w:val="000000"/>
-        </w:rPr>
-        <w:t>2</w:t>
-      </w:r>
-      <w:r>
-        <w:rPr>
-          <w:color w:val="000000"/>
-        </w:rPr>
-        <w:t>}</w:t>
-      </w:r>
-      <w:r>
-        <w:rPr>
-          <w:color w:val="000000"/>
-        </w:rPr>
-        <w:t xml:space="preserve"> months</w:t>
-      </w:r>
-      <w:r>
-        <w:rPr>
-          <w:color w:val="000000"/>
-        </w:rPr>
-        <w:t xml:space="preserve"> </w:t>
-      </w:r>
-      <w:r>
-        <w:rPr>
-          <w:color w:val="000000"/>
-        </w:rPr>
-        <w:t>during h</w:t>
-      </w:r>
-      <w:r>
-        <w:rPr>
-          <w:color w:val="000000"/>
-        </w:rPr>
-        <w:t>eat</w:t>
-      </w:r>
-      <w:r>
-        <w:rPr>
-          <w:color w:val="000000"/>
-        </w:rPr>
-        <w:t>ing</w:t>
-      </w:r>
-      <w:r>
-        <w:rPr>
-          <w:color w:val="000000"/>
-        </w:rPr>
-        <w:t xml:space="preserve"> season </w:t>
-      </w:r>
-      <w:r>
-        <w:rPr>
-          <w:color w:val="000000"/>
-        </w:rPr>
-        <w:t xml:space="preserve">per </w:t>
-      </w:r>
-      <w:r>
-        <w:rPr>
-          <w:color w:val="000000"/>
-        </w:rPr>
-        <w:t>y</w:t>
-      </w:r>
-      <w:r>
-        <w:rPr>
-          <w:color w:val="000000"/>
-        </w:rPr>
-        <w:t>ear</w:t>
-      </w:r>
+      </w:r>
+      <w:r>
+        <w:rPr>
+          <w:color w:val="000000"/>
+        </w:rPr>
+        <w:t>D</w:t>
+      </w:r>
+      <w:r>
+        <w:rPr>
+          <w:color w:val="000000"/>
+        </w:rPr>
+        <w:t>S</w:t>
+      </w:r>
+      <w:r>
+        <w:rPr>
+          <w:color w:val="000000"/>
+        </w:rPr>
+        <w:tab/>
+        <w:t>=</w:t>
+      </w:r>
+      <w:r>
+        <w:rPr>
+          <w:color w:val="000000"/>
+        </w:rPr>
+        <w:t xml:space="preserve"> </w:t>
+      </w:r>
+      <w:r>
+        <w:rPr>
+          <w:color w:val="000000"/>
+        </w:rPr>
+        <w:t>${PR}</w:t>
+      </w:r>
+      <w:r>
+        <w:rPr>
+          <w:color w:val="000000"/>
+        </w:rPr>
+        <w:t xml:space="preserve"> kW </w:t>
+      </w:r>
+      <w:r>
+        <w:rPr>
+          <w:color w:val="000000"/>
+        </w:rPr>
+        <w:t>×</w:t>
+      </w:r>
+      <w:r>
+        <w:rPr>
+          <w:color w:val="000000"/>
+        </w:rPr>
+        <w:t xml:space="preserve"> </w:t>
+      </w:r>
+      <w:r>
+        <w:rPr>
+          <w:color w:val="000000"/>
+        </w:rPr>
+        <w:t>${CF}</w:t>
+      </w:r>
+      <w:r>
+        <w:rPr>
+          <w:color w:val="000000"/>
+        </w:rPr>
+        <w:t>%/</w:t>
+      </w:r>
+      <w:proofErr w:type="spellStart"/>
+      <w:r>
+        <w:rPr>
+          <w:color w:val="000000"/>
+        </w:rPr>
+        <w:t>mo</w:t>
+      </w:r>
+      <w:proofErr w:type="spellEnd"/>
     </w:p>
     <w:p>
       <w:pPr>
@@ -2546,110 +2587,28 @@
         <w:rPr>
           <w:color w:val="000000"/>
         </w:rPr>
-        <w:t>D</w:t>
-      </w:r>
-      <w:r>
-        <w:rPr>
-          <w:color w:val="000000"/>
-        </w:rPr>
-        <w:t>S</w:t>
-      </w:r>
-      <w:r>
-        <w:rPr>
-          <w:color w:val="000000"/>
-        </w:rPr>
-        <w:tab/>
-        <w:t>=</w:t>
-      </w:r>
-      <w:r>
-        <w:rPr>
-          <w:color w:val="000000"/>
-        </w:rPr>
-        <w:t xml:space="preserve"> </w:t>
-      </w:r>
-      <w:r>
-        <w:rPr>
-          <w:color w:val="000000"/>
-        </w:rPr>
-        <w:t>${PR}</w:t>
-      </w:r>
-      <w:r>
-        <w:rPr>
-          <w:color w:val="000000"/>
-        </w:rPr>
-        <w:t xml:space="preserve"> kW </w:t>
-      </w:r>
-      <w:r>
-        <w:rPr>
-          <w:color w:val="000000"/>
-        </w:rPr>
-        <w:t>×</w:t>
-      </w:r>
-      <w:r>
-        <w:rPr>
-          <w:color w:val="000000"/>
-        </w:rPr>
-        <w:t xml:space="preserve"> </w:t>
-      </w:r>
-      <w:r>
-        <w:rPr>
-          <w:color w:val="000000"/>
-        </w:rPr>
-        <w:t>${CF}</w:t>
-      </w:r>
-      <w:r>
-        <w:rPr>
-          <w:color w:val="000000"/>
-        </w:rPr>
-        <w:t xml:space="preserve">%/mo </w:t>
-      </w:r>
-      <w:r>
-        <w:rPr>
-          <w:color w:val="000000"/>
-        </w:rPr>
-        <w:t>×</w:t>
-      </w:r>
-      <w:r>
-        <w:rPr>
-          <w:color w:val="000000"/>
-        </w:rPr>
-        <w:t xml:space="preserve"> </w:t>
-      </w:r>
-      <w:r>
-        <w:rPr>
-          <w:color w:val="000000"/>
-        </w:rPr>
-        <w:t>${C</w:t>
-      </w:r>
-      <w:r>
-        <w:rPr>
-          <w:color w:val="000000"/>
-        </w:rPr>
-        <w:t>2</w:t>
-      </w:r>
-      <w:r>
-        <w:rPr>
-          <w:color w:val="000000"/>
-        </w:rPr>
-        <w:t>}</w:t>
-      </w:r>
-      <w:r>
-        <w:rPr>
-          <w:color w:val="000000"/>
-        </w:rPr>
-        <w:t xml:space="preserve"> mo</w:t>
-      </w:r>
-      <w:r>
-        <w:rPr>
-          <w:color w:val="000000"/>
-        </w:rPr>
-        <w:t>s</w:t>
-      </w:r>
-      <w:r>
-        <w:rPr>
-          <w:color w:val="000000"/>
-        </w:rPr>
-        <w:t>/yr</w:t>
+        <w:tab/>
+      </w:r>
+      <w:r>
+        <w:rPr>
+          <w:color w:val="000000"/>
+        </w:rPr>
+        <w:t xml:space="preserve">= </w:t>
+      </w:r>
+      <w:r>
+        <w:t>${DS}</w:t>
+      </w:r>
+      <w:r>
+        <w:rPr>
+          <w:color w:val="000000"/>
+        </w:rPr>
+        <w:t xml:space="preserve"> </w:t>
+      </w:r>
+      <w:r>
+        <w:rPr>
+          <w:color w:val="000000"/>
+        </w:rPr>
+        <w:t>kW/yr.</w:t>
       </w:r>
     </w:p>
     <w:p>
@@ -2677,29 +2636,16 @@
         <w:rPr>
           <w:color w:val="000000"/>
         </w:rPr>
-        <w:tab/>
-      </w:r>
-      <w:r>
-        <w:rPr>
-          <w:color w:val="000000"/>
-        </w:rPr>
-        <w:t xml:space="preserve">= </w:t>
-      </w:r>
-      <w:r>
-        <w:t>${DS}</w:t>
-      </w:r>
-      <w:r>
-        <w:rPr>
-          <w:color w:val="000000"/>
-        </w:rPr>
-        <w:t xml:space="preserve"> </w:t>
-      </w:r>
-      <w:r>
-        <w:rPr>
-          <w:color w:val="000000"/>
-        </w:rPr>
-        <w:t>kW/yr.</w:t>
-      </w:r>
+        <w:t xml:space="preserve">The annual cost savings, ACS, </w:t>
+      </w:r>
+      <w:proofErr w:type="gramStart"/>
+      <w:r>
+        <w:rPr>
+          <w:color w:val="000000"/>
+        </w:rPr>
+        <w:t>is</w:t>
+      </w:r>
+      <w:proofErr w:type="gramEnd"/>
     </w:p>
     <w:p>
       <w:pPr>
@@ -2726,7 +2672,122 @@
         <w:rPr>
           <w:color w:val="000000"/>
         </w:rPr>
-        <w:t>The annual cost savings, ACS, is</w:t>
+        <w:t>ACS</w:t>
+      </w:r>
+      <w:r>
+        <w:rPr>
+          <w:color w:val="000000"/>
+        </w:rPr>
+        <w:tab/>
+        <w:t xml:space="preserve">= </w:t>
+      </w:r>
+      <w:r>
+        <w:rPr>
+          <w:color w:val="000000"/>
+        </w:rPr>
+        <w:t>(</w:t>
+      </w:r>
+      <w:r>
+        <w:rPr>
+          <w:color w:val="000000"/>
+        </w:rPr>
+        <w:t>ES</w:t>
+      </w:r>
+      <w:r>
+        <w:rPr>
+          <w:color w:val="000000"/>
+        </w:rPr>
+        <w:t xml:space="preserve"> </w:t>
+      </w:r>
+      <w:r>
+        <w:rPr>
+          <w:color w:val="000000"/>
+        </w:rPr>
+        <w:t>×</w:t>
+      </w:r>
+      <w:r>
+        <w:rPr>
+          <w:color w:val="000000"/>
+        </w:rPr>
+        <w:t xml:space="preserve"> </w:t>
+      </w:r>
+      <w:r>
+        <w:rPr>
+          <w:color w:val="000000"/>
+        </w:rPr>
+        <w:t>E</w:t>
+      </w:r>
+      <w:r>
+        <w:rPr>
+          <w:color w:val="000000"/>
+        </w:rPr>
+        <w:t>lectricity</w:t>
+      </w:r>
+      <w:r>
+        <w:rPr>
+          <w:color w:val="000000"/>
+        </w:rPr>
+        <w:t xml:space="preserve"> Cost</w:t>
+      </w:r>
+      <w:r>
+        <w:rPr>
+          <w:color w:val="000000"/>
+        </w:rPr>
+        <w:t>)</w:t>
+      </w:r>
+      <w:r>
+        <w:rPr>
+          <w:color w:val="000000"/>
+        </w:rPr>
+        <w:t xml:space="preserve"> + </w:t>
+      </w:r>
+      <w:r>
+        <w:rPr>
+          <w:color w:val="000000"/>
+        </w:rPr>
+        <w:t>(</w:t>
+      </w:r>
+      <w:r>
+        <w:rPr>
+          <w:color w:val="000000"/>
+        </w:rPr>
+        <w:t>D</w:t>
+      </w:r>
+      <w:r>
+        <w:rPr>
+          <w:color w:val="000000"/>
+        </w:rPr>
+        <w:t>S</w:t>
+      </w:r>
+      <w:r>
+        <w:rPr>
+          <w:color w:val="000000"/>
+        </w:rPr>
+        <w:t xml:space="preserve"> </w:t>
+      </w:r>
+      <w:r>
+        <w:rPr>
+          <w:color w:val="000000"/>
+        </w:rPr>
+        <w:t>×</w:t>
+      </w:r>
+      <w:r>
+        <w:rPr>
+          <w:color w:val="000000"/>
+        </w:rPr>
+        <w:t xml:space="preserve"> </w:t>
+      </w:r>
+      <w:r>
+        <w:rPr>
+          <w:color w:val="000000"/>
+        </w:rPr>
+        <w:t>Demand Cost</w:t>
+      </w:r>
+      <w:r>
+        <w:rPr>
+          <w:color w:val="000000"/>
+        </w:rPr>
+        <w:t>)</w:t>
       </w:r>
     </w:p>
     <w:p>
@@ -2754,13 +2815,12 @@
         <w:rPr>
           <w:color w:val="000000"/>
         </w:rPr>
-        <w:t>ACS</w:t>
-      </w:r>
-      <w:r>
-        <w:rPr>
-          <w:color w:val="000000"/>
-        </w:rPr>
-        <w:tab/>
+        <w:tab/>
+      </w:r>
+      <w:r>
+        <w:rPr>
+          <w:color w:val="000000"/>
+        </w:rPr>
         <w:t xml:space="preserve">= </w:t>
       </w:r>
       <w:r>
@@ -2770,10 +2830,19 @@
         <w:t>(</w:t>
       </w:r>
       <w:r>
-        <w:rPr>
-          <w:color w:val="000000"/>
-        </w:rPr>
-        <w:t>ES</w:t>
+        <w:t>${ES}</w:t>
+      </w:r>
+      <w:r>
+        <w:rPr>
+          <w:color w:val="000000"/>
+        </w:rPr>
+        <w:t xml:space="preserve"> </w:t>
+      </w:r>
+      <w:r>
+        <w:rPr>
+          <w:color w:val="000000"/>
+        </w:rPr>
+        <w:t>kWh/yr</w:t>
       </w:r>
       <w:r>
         <w:rPr>
@@ -2794,22 +2863,13 @@
         <w:t xml:space="preserve"> </w:t>
       </w:r>
       <w:r>
-        <w:rPr>
-          <w:color w:val="000000"/>
-        </w:rPr>
-        <w:t>E</w:t>
-      </w:r>
-      <w:r>
-        <w:rPr>
-          <w:color w:val="000000"/>
-        </w:rPr>
-        <w:t>lectricity</w:t>
-      </w:r>
-      <w:r>
-        <w:rPr>
-          <w:color w:val="000000"/>
-        </w:rPr>
-        <w:t xml:space="preserve"> Cost</w:t>
+        <w:t>${EC}</w:t>
+      </w:r>
+      <w:r>
+        <w:rPr>
+          <w:color w:val="000000"/>
+        </w:rPr>
+        <w:t>/kWh</w:t>
       </w:r>
       <w:r>
         <w:rPr>
@@ -2833,19 +2893,19 @@
         <w:rPr>
           <w:color w:val="000000"/>
         </w:rPr>
-        <w:t>D</w:t>
-      </w:r>
-      <w:r>
-        <w:rPr>
-          <w:color w:val="000000"/>
-        </w:rPr>
-        <w:t>S</w:t>
-      </w:r>
-      <w:r>
-        <w:rPr>
-          <w:color w:val="000000"/>
-        </w:rPr>
-        <w:t xml:space="preserve"> </w:t>
+        <w:t>${DS}</w:t>
+      </w:r>
+      <w:r>
+        <w:rPr>
+          <w:color w:val="000000"/>
+        </w:rPr>
+        <w:t xml:space="preserve"> </w:t>
+      </w:r>
+      <w:r>
+        <w:rPr>
+          <w:color w:val="000000"/>
+        </w:rPr>
+        <w:t xml:space="preserve">kW/yr </w:t>
       </w:r>
       <w:r>
         <w:rPr>
@@ -2860,10 +2920,13 @@
         <w:t xml:space="preserve"> </w:t>
       </w:r>
       <w:r>
-        <w:rPr>
-          <w:color w:val="000000"/>
-        </w:rPr>
-        <w:t>Demand Cost</w:t>
+        <w:t>${DC}</w:t>
+      </w:r>
+      <w:r>
+        <w:rPr>
+          <w:color w:val="000000"/>
+        </w:rPr>
+        <w:t>/kW</w:t>
       </w:r>
       <w:r>
         <w:rPr>
@@ -2906,115 +2969,22 @@
         <w:t xml:space="preserve">= </w:t>
       </w:r>
       <w:r>
-        <w:rPr>
-          <w:color w:val="000000"/>
-        </w:rPr>
-        <w:t>(</w:t>
-      </w:r>
-      <w:r>
-        <w:t>${ES}</w:t>
-      </w:r>
-      <w:r>
-        <w:rPr>
-          <w:color w:val="000000"/>
-        </w:rPr>
-        <w:t xml:space="preserve"> </w:t>
-      </w:r>
-      <w:r>
-        <w:rPr>
-          <w:color w:val="000000"/>
-        </w:rPr>
-        <w:t>kWh/yr</w:t>
-      </w:r>
-      <w:r>
-        <w:rPr>
-          <w:color w:val="000000"/>
-        </w:rPr>
-        <w:t xml:space="preserve"> </w:t>
-      </w:r>
-      <w:r>
-        <w:rPr>
-          <w:color w:val="000000"/>
-        </w:rPr>
-        <w:t>×</w:t>
-      </w:r>
-      <w:r>
-        <w:rPr>
-          <w:color w:val="000000"/>
-        </w:rPr>
-        <w:t xml:space="preserve"> </w:t>
-      </w:r>
-      <w:r>
-        <w:t>${EC}</w:t>
-      </w:r>
-      <w:r>
-        <w:rPr>
-          <w:color w:val="000000"/>
-        </w:rPr>
-        <w:t>/kWh</w:t>
-      </w:r>
-      <w:r>
-        <w:rPr>
-          <w:color w:val="000000"/>
-        </w:rPr>
-        <w:t>)</w:t>
-      </w:r>
-      <w:r>
-        <w:rPr>
-          <w:color w:val="000000"/>
-        </w:rPr>
-        <w:t xml:space="preserve"> + </w:t>
-      </w:r>
-      <w:r>
-        <w:rPr>
-          <w:color w:val="000000"/>
-        </w:rPr>
-        <w:t>(</w:t>
-      </w:r>
-      <w:r>
-        <w:rPr>
-          <w:color w:val="000000"/>
-        </w:rPr>
-        <w:t>${DS}</w:t>
-      </w:r>
-      <w:r>
-        <w:rPr>
-          <w:color w:val="000000"/>
-        </w:rPr>
-        <w:t xml:space="preserve"> </w:t>
-      </w:r>
-      <w:r>
-        <w:rPr>
-          <w:color w:val="000000"/>
-        </w:rPr>
-        <w:t xml:space="preserve">kW/yr </w:t>
-      </w:r>
-      <w:r>
-        <w:rPr>
-          <w:color w:val="000000"/>
-        </w:rPr>
-        <w:t>×</w:t>
-      </w:r>
-      <w:r>
-        <w:rPr>
-          <w:color w:val="000000"/>
-        </w:rPr>
-        <w:t xml:space="preserve"> </w:t>
-      </w:r>
-      <w:r>
-        <w:t>${DC}</w:t>
-      </w:r>
-      <w:r>
-        <w:rPr>
-          <w:color w:val="000000"/>
-        </w:rPr>
-        <w:t>/kW</w:t>
-      </w:r>
-      <w:r>
-        <w:rPr>
-          <w:color w:val="000000"/>
-        </w:rPr>
-        <w:t>)</w:t>
+        <w:t>${ECS}</w:t>
+      </w:r>
+      <w:r>
+        <w:rPr>
+          <w:color w:val="000000"/>
+        </w:rPr>
+        <w:t xml:space="preserve">/yr + </w:t>
+      </w:r>
+      <w:r>
+        <w:t>${DCS}</w:t>
+      </w:r>
+      <w:r>
+        <w:rPr>
+          <w:color w:val="000000"/>
+        </w:rPr>
+        <w:t>/yr</w:t>
       </w:r>
     </w:p>
     <w:p>
@@ -3051,22 +3021,37 @@
         <w:t xml:space="preserve">= </w:t>
       </w:r>
       <w:r>
-        <w:t>${ECS}</w:t>
-      </w:r>
-      <w:r>
-        <w:rPr>
-          <w:color w:val="000000"/>
-        </w:rPr>
-        <w:t xml:space="preserve">/yr + </w:t>
-      </w:r>
-      <w:r>
-        <w:t>${DCS}</w:t>
-      </w:r>
-      <w:r>
-        <w:rPr>
-          <w:color w:val="000000"/>
-        </w:rPr>
-        <w:t>/yr</w:t>
+        <w:t>${ACS}</w:t>
+      </w:r>
+      <w:r>
+        <w:rPr>
+          <w:color w:val="000000"/>
+        </w:rPr>
+        <w:t>/yr.</w:t>
+      </w:r>
+    </w:p>
+    <w:p>
+      <w:pPr>
+        <w:pBdr>
+          <w:top w:val="nil"/>
+          <w:left w:val="nil"/>
+          <w:bottom w:val="nil"/>
+          <w:right w:val="nil"/>
+          <w:between w:val="nil"/>
+        </w:pBdr>
+        <w:spacing w:before="120" w:line="360" w:lineRule="auto"/>
+        <w:jc w:val="both"/>
+        <w:rPr>
+          <w:b/>
+          <w:color w:val="000000"/>
+        </w:rPr>
+      </w:pPr>
+      <w:r>
+        <w:rPr>
+          <w:b/>
+          <w:color w:val="000000"/>
+        </w:rPr>
+        <w:t>Implementation Cost</w:t>
       </w:r>
     </w:p>
     <w:p>
@@ -3081,35 +3066,121 @@
         <w:spacing w:line="360" w:lineRule="auto"/>
         <w:jc w:val="both"/>
         <w:rPr>
-          <w:color w:val="000000"/>
-        </w:rPr>
-      </w:pPr>
-      <w:r>
-        <w:rPr>
-          <w:color w:val="000000"/>
-        </w:rPr>
-        <w:tab/>
-      </w:r>
-      <w:r>
-        <w:rPr>
-          <w:color w:val="000000"/>
-        </w:rPr>
-        <w:tab/>
-      </w:r>
-      <w:r>
-        <w:rPr>
-          <w:color w:val="000000"/>
-        </w:rPr>
-        <w:t xml:space="preserve">= </w:t>
-      </w:r>
-      <w:r>
-        <w:t>${ACS}</w:t>
-      </w:r>
-      <w:r>
-        <w:rPr>
-          <w:color w:val="000000"/>
-        </w:rPr>
-        <w:t>/yr.</w:t>
+          <w:b/>
+          <w:color w:val="000000"/>
+        </w:rPr>
+      </w:pPr>
+      <w:r>
+        <w:rPr>
+          <w:b/>
+          <w:color w:val="000000"/>
+        </w:rPr>
+        <w:tab/>
+      </w:r>
+      <w:r>
+        <w:rPr>
+          <w:color w:val="000000"/>
+        </w:rPr>
+        <w:t>The implementation cost includes the cost of material and installation of ductwork and a damper. The cost of materials, ductwork, dampers</w:t>
+      </w:r>
+      <w:r>
+        <w:rPr>
+          <w:color w:val="000000"/>
+        </w:rPr>
+        <w:t>, and installation</w:t>
+      </w:r>
+      <w:r>
+        <w:rPr>
+          <w:color w:val="000000"/>
+        </w:rPr>
+        <w:t xml:space="preserve"> is</w:t>
+      </w:r>
+      <w:r>
+        <w:rPr>
+          <w:color w:val="000000"/>
+        </w:rPr>
+        <w:t xml:space="preserve"> estimated to be</w:t>
+      </w:r>
+      <w:r>
+        <w:rPr>
+          <w:color w:val="000000"/>
+        </w:rPr>
+        <w:t xml:space="preserve"> </w:t>
+      </w:r>
+      <w:r>
+        <w:t>${IC}.</w:t>
+      </w:r>
+      <w:r>
+        <w:rPr>
+          <w:color w:val="000000"/>
+        </w:rPr>
+        <w:t xml:space="preserve"> Ductwork must be provided from the intake of the compressor to the outside of the plant. The </w:t>
+      </w:r>
+      <w:r>
+        <w:rPr>
+          <w:color w:val="000000"/>
+        </w:rPr>
+        <w:lastRenderedPageBreak/>
+        <w:t>damper should remain open when the outside temperature is lower than the temperature near the compressors and should be closed during summer when outside air is relatively warmer than the air in the plant.</w:t>
+      </w:r>
+    </w:p>
+    <w:p>
+      <w:pPr>
+        <w:pBdr>
+          <w:top w:val="nil"/>
+          <w:left w:val="nil"/>
+          <w:bottom w:val="nil"/>
+          <w:right w:val="nil"/>
+          <w:between w:val="nil"/>
+        </w:pBdr>
+        <w:spacing w:line="360" w:lineRule="auto"/>
+        <w:jc w:val="both"/>
+        <w:rPr>
+          <w:b/>
+          <w:color w:val="000000"/>
+        </w:rPr>
+      </w:pPr>
+      <w:r>
+        <w:rPr>
+          <w:color w:val="000000"/>
+        </w:rPr>
+        <w:tab/>
+      </w:r>
+      <w:r>
+        <w:rPr>
+          <w:color w:val="000000"/>
+        </w:rPr>
+        <w:t xml:space="preserve">It is recommended that during any contact with vendors for the implementation of this </w:t>
+      </w:r>
+      <w:r>
+        <w:rPr>
+          <w:color w:val="000000"/>
+        </w:rPr>
+        <w:t>recommendation</w:t>
+      </w:r>
+      <w:r>
+        <w:rPr>
+          <w:color w:val="000000"/>
+        </w:rPr>
+        <w:t xml:space="preserve">, any effects of moisture content of the outside air on the compressor be </w:t>
+      </w:r>
+      <w:r>
+        <w:rPr>
+          <w:color w:val="000000"/>
+        </w:rPr>
+        <w:t>considered</w:t>
+      </w:r>
+      <w:r>
+        <w:rPr>
+          <w:color w:val="000000"/>
+        </w:rPr>
+        <w:t>. During colder months, outside air is dryer, but during the summer months that may not be true.</w:t>
+      </w:r>
+      <w:r>
+        <w:rPr>
+          <w:color w:val="000000"/>
+        </w:rPr>
+        <w:t xml:space="preserve"> Additionally, a control system should be implemented such that the outdoor damper is closed if the ambient air is below freezing as that can damage the compressor.</w:t>
       </w:r>
     </w:p>
     <w:p>
@@ -3126,141 +3197,6 @@
         <w:rPr>
           <w:b/>
           <w:color w:val="000000"/>
-        </w:rPr>
-      </w:pPr>
-      <w:r>
-        <w:rPr>
-          <w:b/>
-          <w:color w:val="000000"/>
-        </w:rPr>
-        <w:lastRenderedPageBreak/>
-        <w:t>Implementation Cost</w:t>
-      </w:r>
-    </w:p>
-    <w:p>
-      <w:pPr>
-        <w:pBdr>
-          <w:top w:val="nil"/>
-          <w:left w:val="nil"/>
-          <w:bottom w:val="nil"/>
-          <w:right w:val="nil"/>
-          <w:between w:val="nil"/>
-        </w:pBdr>
-        <w:spacing w:line="360" w:lineRule="auto"/>
-        <w:jc w:val="both"/>
-        <w:rPr>
-          <w:b/>
-          <w:color w:val="000000"/>
-        </w:rPr>
-      </w:pPr>
-      <w:r>
-        <w:rPr>
-          <w:b/>
-          <w:color w:val="000000"/>
-        </w:rPr>
-        <w:tab/>
-      </w:r>
-      <w:r>
-        <w:rPr>
-          <w:color w:val="000000"/>
-        </w:rPr>
-        <w:t>The implementation cost includes the cost of material and installation of ductwork and a damper. The cost of materials, ductwork, dampers</w:t>
-      </w:r>
-      <w:r>
-        <w:rPr>
-          <w:color w:val="000000"/>
-        </w:rPr>
-        <w:t>, and installation</w:t>
-      </w:r>
-      <w:r>
-        <w:rPr>
-          <w:color w:val="000000"/>
-        </w:rPr>
-        <w:t xml:space="preserve"> is</w:t>
-      </w:r>
-      <w:r>
-        <w:rPr>
-          <w:color w:val="000000"/>
-        </w:rPr>
-        <w:t xml:space="preserve"> estimated to be</w:t>
-      </w:r>
-      <w:r>
-        <w:rPr>
-          <w:color w:val="000000"/>
-        </w:rPr>
-        <w:t xml:space="preserve"> </w:t>
-      </w:r>
-      <w:r>
-        <w:t>${IC}.</w:t>
-      </w:r>
-      <w:r>
-        <w:rPr>
-          <w:color w:val="000000"/>
-        </w:rPr>
-        <w:t xml:space="preserve"> Ductwork must be provided from the intake of the compressor to the outside of the plant. The damper should remain open when the outside temperature is lower than the temperature near the compressors and should be closed during summer when outside air is relatively warmer than the air in the plant.</w:t>
-      </w:r>
-    </w:p>
-    <w:p>
-      <w:pPr>
-        <w:pBdr>
-          <w:top w:val="nil"/>
-          <w:left w:val="nil"/>
-          <w:bottom w:val="nil"/>
-          <w:right w:val="nil"/>
-          <w:between w:val="nil"/>
-        </w:pBdr>
-        <w:spacing w:line="360" w:lineRule="auto"/>
-        <w:jc w:val="both"/>
-        <w:rPr>
-          <w:b/>
-          <w:color w:val="000000"/>
-        </w:rPr>
-      </w:pPr>
-      <w:r>
-        <w:rPr>
-          <w:color w:val="000000"/>
-        </w:rPr>
-        <w:tab/>
-      </w:r>
-      <w:r>
-        <w:rPr>
-          <w:color w:val="000000"/>
-        </w:rPr>
-        <w:t xml:space="preserve">It is recommended that during any contact with vendors for the implementation of this </w:t>
-      </w:r>
-      <w:r>
-        <w:rPr>
-          <w:color w:val="000000"/>
-        </w:rPr>
-        <w:t>recommendation</w:t>
-      </w:r>
-      <w:r>
-        <w:rPr>
-          <w:color w:val="000000"/>
-        </w:rPr>
-        <w:t>, any effects of moisture content of the outside air on the compressor be taken into account. During colder months, outside air is dryer, but during the summer months that may not be true.</w:t>
-      </w:r>
-      <w:r>
-        <w:rPr>
-          <w:color w:val="000000"/>
-        </w:rPr>
-        <w:t xml:space="preserve"> Additionally, a control system should be implemented such that the outdoor damper is closed if the ambient air is below freezing as that can damage the compressor.</w:t>
-      </w:r>
-    </w:p>
-    <w:p>
-      <w:pPr>
-        <w:pBdr>
-          <w:top w:val="nil"/>
-          <w:left w:val="nil"/>
-          <w:bottom w:val="nil"/>
-          <w:right w:val="nil"/>
-          <w:between w:val="nil"/>
-        </w:pBdr>
-        <w:spacing w:before="120" w:line="360" w:lineRule="auto"/>
-        <w:jc w:val="both"/>
-        <w:rPr>
-          <w:b/>
-          <w:color w:val="000000"/>
           <w:u w:val="single"/>
         </w:rPr>
       </w:pPr>
@@ -3459,7 +3395,21 @@
         <w:rPr>
           <w:color w:val="000000"/>
         </w:rPr>
-        <w:t>The below links are for implementation cost references. We do not endorse/recommend these brands or products. Furthermore, these products may or may not be suitable for the application. The client should contact a vendor(s) to conduct a detailed study of the process, in order to determine the best product for the recommended application. </w:t>
+        <w:t xml:space="preserve">The below links are for implementation cost references. We do not endorse/recommend these brands or products. Furthermore, these products may or may not be suitable for the application. The client should contact a vendor(s) to conduct a detailed study of the process, </w:t>
+      </w:r>
+      <w:proofErr w:type="gramStart"/>
+      <w:r>
+        <w:rPr>
+          <w:color w:val="000000"/>
+        </w:rPr>
+        <w:t>in order to</w:t>
+      </w:r>
+      <w:proofErr w:type="gramEnd"/>
+      <w:r>
+        <w:rPr>
+          <w:color w:val="000000"/>
+        </w:rPr>
+        <w:t xml:space="preserve"> determine the best product for the recommended application. </w:t>
       </w:r>
     </w:p>
     <w:p>
@@ -3562,27 +3512,6 @@
       <w:r>
         <w:continuationSeparator/>
       </w:r>
-    </w:p>
-  </w:footnote>
-  <w:footnote w:id="1">
-    <w:p>
-      <w:pPr>
-        <w:pStyle w:val="FootnoteText"/>
-      </w:pPr>
-      <w:r>
-        <w:rPr>
-          <w:rStyle w:val="FootnoteReference"/>
-        </w:rPr>
-        <w:footnoteRef/>
-      </w:r>
-      <w:hyperlink r:id="rId1" w:history="1">
-        <w:r>
-          <w:rPr>
-            <w:rStyle w:val="Hyperlink"/>
-          </w:rPr>
-          <w:t>Weather Data (Meteostat)</w:t>
-        </w:r>
-      </w:hyperlink>
     </w:p>
   </w:footnote>
 </w:footnotes>
@@ -4785,28 +4714,28 @@
 </file>
 
 <file path=customXml/item1.xml><?xml version="1.0" encoding="utf-8"?>
+<b:Sources xmlns:b="http://schemas.openxmlformats.org/officeDocument/2006/bibliography" xmlns="http://schemas.openxmlformats.org/officeDocument/2006/bibliography" SelectedStyle="\APASixthEditionOfficeOnline.xsl" StyleName="APA" Version="6"/>
+</file>
+
+<file path=customXml/item2.xml><?xml version="1.0" encoding="utf-8"?>
 <go:gDocsCustomXmlDataStorage xmlns:go="http://customooxmlschemas.google.com/" xmlns:r="http://schemas.openxmlformats.org/officeDocument/2006/relationships">
   <go:docsCustomData xmlns:go="http://customooxmlschemas.google.com/" roundtripDataSignature="AMtx7mgPfjAAxZsTr00mtqc0gLF50YPvhA==">AMUW2mVfVv55M1f4YR1wAdOx+hT2UPotz/YiB+VeMZ/5pMAmUY/MysHfHojLjbvpKVhgCCAxj4Jt6Vcy0zM2DgdHYDMmh4Z8HapuJh7qAHqlBoRL7W5WP1dSC+UtphzEnUlx8fB/XlFl</go:docsCustomData>
 </go:gDocsCustomXmlDataStorage>
 </file>
 
-<file path=customXml/item2.xml><?xml version="1.0" encoding="utf-8"?>
-<b:Sources xmlns:b="http://schemas.openxmlformats.org/officeDocument/2006/bibliography" xmlns="http://schemas.openxmlformats.org/officeDocument/2006/bibliography" SelectedStyle="\APASixthEditionOfficeOnline.xsl" StyleName="APA" Version="6"/>
+<file path=customXml/itemProps1.xml><?xml version="1.0" encoding="utf-8"?>
+<ds:datastoreItem xmlns:ds="http://schemas.openxmlformats.org/officeDocument/2006/customXml" ds:itemID="{9AC69D07-9E0D-4340-AB54-DDC11E988AE7}">
+  <ds:schemaRefs>
+    <ds:schemaRef ds:uri="http://schemas.openxmlformats.org/officeDocument/2006/bibliography"/>
+  </ds:schemaRefs>
+</ds:datastoreItem>
 </file>
 
-<file path=customXml/itemProps1.xml><?xml version="1.0" encoding="utf-8"?>
+<file path=customXml/itemProps2.xml><?xml version="1.0" encoding="utf-8"?>
 <ds:datastoreItem xmlns:ds="http://schemas.openxmlformats.org/officeDocument/2006/customXml" ds:itemID="{11111111-1234-1234-1234-123412341234}">
   <ds:schemaRefs>
     <ds:schemaRef ds:uri="http://customooxmlschemas.google.com/"/>
     <ds:schemaRef ds:uri="http://schemas.openxmlformats.org/officeDocument/2006/relationships"/>
   </ds:schemaRefs>
 </ds:datastoreItem>
-</file>
-
-<file path=customXml/itemProps2.xml><?xml version="1.0" encoding="utf-8"?>
-<ds:datastoreItem xmlns:ds="http://schemas.openxmlformats.org/officeDocument/2006/customXml" ds:itemID="{9AC69D07-9E0D-4340-AB54-DDC11E988AE7}">
-  <ds:schemaRefs>
-    <ds:schemaRef ds:uri="http://schemas.openxmlformats.org/officeDocument/2006/bibliography"/>
-  </ds:schemaRefs>
-</ds:datastoreItem>
 </file>
</xml_diff>